<commit_message>
v3.3.1a: ajustes nos modelos AR e AF
Co-Authored-By: Claude Sonnet 4.6 <noreply@anthropic.com>
</commit_message>
<xml_diff>
--- a/Modelo_AF.docx
+++ b/Modelo_AF.docx
@@ -1079,18 +1079,6 @@
         </w:rPr>
         <w:t>GABARITO</w:t>
       </w:r>
-      <w:r>
-        <w:rPr>
-          <w:rFonts w:eastAsia="Times New Roman" w:cs="Arial" w:ascii="Arial" w:hAnsi="Arial"/>
-          <w:b/>
-          <w:bCs/>
-          <w:color w:val="FF0000"/>
-          <w:kern w:val="0"/>
-          <w:lang w:eastAsia="pt-BR"/>
-          <w14:ligatures w14:val="none"/>
-        </w:rPr>
-        <w:t xml:space="preserve"> (opcional)</w:t>
-      </w:r>
     </w:p>
     <w:p>
       <w:pPr>
@@ -1139,27 +1127,27 @@
         <w:tblLook w:val="04a0" w:noHBand="0" w:noVBand="1" w:firstColumn="1" w:lastRow="0" w:lastColumn="0" w:firstRow="1"/>
       </w:tblPr>
       <w:tblGrid>
-        <w:gridCol w:w="1043"/>
+        <w:gridCol w:w="1042"/>
+        <w:gridCol w:w="444"/>
         <w:gridCol w:w="443"/>
+        <w:gridCol w:w="442"/>
+        <w:gridCol w:w="444"/>
         <w:gridCol w:w="443"/>
+        <w:gridCol w:w="442"/>
+        <w:gridCol w:w="444"/>
         <w:gridCol w:w="443"/>
+        <w:gridCol w:w="442"/>
+        <w:gridCol w:w="444"/>
         <w:gridCol w:w="443"/>
+        <w:gridCol w:w="442"/>
+        <w:gridCol w:w="444"/>
         <w:gridCol w:w="443"/>
+        <w:gridCol w:w="442"/>
+        <w:gridCol w:w="444"/>
         <w:gridCol w:w="443"/>
-        <w:gridCol w:w="443"/>
-        <w:gridCol w:w="443"/>
-        <w:gridCol w:w="443"/>
-        <w:gridCol w:w="443"/>
-        <w:gridCol w:w="443"/>
-        <w:gridCol w:w="443"/>
-        <w:gridCol w:w="443"/>
-        <w:gridCol w:w="443"/>
-        <w:gridCol w:w="443"/>
-        <w:gridCol w:w="443"/>
-        <w:gridCol w:w="443"/>
-        <w:gridCol w:w="443"/>
-        <w:gridCol w:w="443"/>
-        <w:gridCol w:w="443"/>
+        <w:gridCol w:w="442"/>
+        <w:gridCol w:w="444"/>
+        <w:gridCol w:w="440"/>
       </w:tblGrid>
       <w:tr>
         <w:trPr>
@@ -1167,7 +1155,7 @@
         </w:trPr>
         <w:tc>
           <w:tcPr>
-            <w:tcW w:w="1043" w:type="dxa"/>
+            <w:tcW w:w="1042" w:type="dxa"/>
             <w:tcBorders>
               <w:top w:val="single" w:sz="2" w:space="0" w:color="000000"/>
               <w:left w:val="single" w:sz="2" w:space="0" w:color="000000"/>
@@ -1201,7 +1189,7 @@
         </w:tc>
         <w:tc>
           <w:tcPr>
-            <w:tcW w:w="443" w:type="dxa"/>
+            <w:tcW w:w="444" w:type="dxa"/>
             <w:tcBorders>
               <w:top w:val="single" w:sz="2" w:space="0" w:color="000000"/>
               <w:left w:val="single" w:sz="2" w:space="0" w:color="000000"/>
@@ -1279,7 +1267,7 @@
         </w:tc>
         <w:tc>
           <w:tcPr>
-            <w:tcW w:w="443" w:type="dxa"/>
+            <w:tcW w:w="442" w:type="dxa"/>
             <w:tcBorders>
               <w:top w:val="single" w:sz="2" w:space="0" w:color="000000"/>
               <w:left w:val="single" w:sz="2" w:space="0" w:color="000000"/>
@@ -1318,7 +1306,7 @@
         </w:tc>
         <w:tc>
           <w:tcPr>
-            <w:tcW w:w="443" w:type="dxa"/>
+            <w:tcW w:w="444" w:type="dxa"/>
             <w:tcBorders>
               <w:top w:val="single" w:sz="2" w:space="0" w:color="000000"/>
               <w:left w:val="single" w:sz="2" w:space="0" w:color="000000"/>
@@ -1396,7 +1384,7 @@
         </w:tc>
         <w:tc>
           <w:tcPr>
-            <w:tcW w:w="443" w:type="dxa"/>
+            <w:tcW w:w="442" w:type="dxa"/>
             <w:tcBorders>
               <w:top w:val="single" w:sz="2" w:space="0" w:color="000000"/>
               <w:left w:val="single" w:sz="2" w:space="0" w:color="000000"/>
@@ -1435,7 +1423,7 @@
         </w:tc>
         <w:tc>
           <w:tcPr>
-            <w:tcW w:w="443" w:type="dxa"/>
+            <w:tcW w:w="444" w:type="dxa"/>
             <w:tcBorders>
               <w:top w:val="single" w:sz="2" w:space="0" w:color="000000"/>
               <w:left w:val="single" w:sz="2" w:space="0" w:color="000000"/>
@@ -1513,7 +1501,7 @@
         </w:tc>
         <w:tc>
           <w:tcPr>
-            <w:tcW w:w="443" w:type="dxa"/>
+            <w:tcW w:w="442" w:type="dxa"/>
             <w:tcBorders>
               <w:top w:val="single" w:sz="2" w:space="0" w:color="000000"/>
               <w:left w:val="single" w:sz="2" w:space="0" w:color="000000"/>
@@ -1552,7 +1540,7 @@
         </w:tc>
         <w:tc>
           <w:tcPr>
-            <w:tcW w:w="443" w:type="dxa"/>
+            <w:tcW w:w="444" w:type="dxa"/>
             <w:tcBorders>
               <w:top w:val="single" w:sz="2" w:space="0" w:color="000000"/>
               <w:left w:val="single" w:sz="2" w:space="0" w:color="000000"/>
@@ -1630,7 +1618,7 @@
         </w:tc>
         <w:tc>
           <w:tcPr>
-            <w:tcW w:w="443" w:type="dxa"/>
+            <w:tcW w:w="442" w:type="dxa"/>
             <w:tcBorders>
               <w:top w:val="single" w:sz="2" w:space="0" w:color="000000"/>
               <w:left w:val="single" w:sz="2" w:space="0" w:color="000000"/>
@@ -1669,7 +1657,7 @@
         </w:tc>
         <w:tc>
           <w:tcPr>
-            <w:tcW w:w="443" w:type="dxa"/>
+            <w:tcW w:w="444" w:type="dxa"/>
             <w:tcBorders>
               <w:top w:val="single" w:sz="2" w:space="0" w:color="000000"/>
               <w:left w:val="single" w:sz="2" w:space="0" w:color="000000"/>
@@ -1747,7 +1735,7 @@
         </w:tc>
         <w:tc>
           <w:tcPr>
-            <w:tcW w:w="443" w:type="dxa"/>
+            <w:tcW w:w="442" w:type="dxa"/>
             <w:tcBorders>
               <w:top w:val="single" w:sz="2" w:space="0" w:color="000000"/>
               <w:left w:val="single" w:sz="2" w:space="0" w:color="000000"/>
@@ -1786,7 +1774,7 @@
         </w:tc>
         <w:tc>
           <w:tcPr>
-            <w:tcW w:w="443" w:type="dxa"/>
+            <w:tcW w:w="444" w:type="dxa"/>
             <w:tcBorders>
               <w:top w:val="single" w:sz="2" w:space="0" w:color="000000"/>
               <w:left w:val="single" w:sz="2" w:space="0" w:color="000000"/>
@@ -1864,7 +1852,7 @@
         </w:tc>
         <w:tc>
           <w:tcPr>
-            <w:tcW w:w="443" w:type="dxa"/>
+            <w:tcW w:w="442" w:type="dxa"/>
             <w:tcBorders>
               <w:top w:val="single" w:sz="2" w:space="0" w:color="000000"/>
               <w:left w:val="single" w:sz="2" w:space="0" w:color="000000"/>
@@ -1903,7 +1891,7 @@
         </w:tc>
         <w:tc>
           <w:tcPr>
-            <w:tcW w:w="443" w:type="dxa"/>
+            <w:tcW w:w="444" w:type="dxa"/>
             <w:tcBorders>
               <w:top w:val="single" w:sz="2" w:space="0" w:color="000000"/>
               <w:left w:val="single" w:sz="2" w:space="0" w:color="000000"/>
@@ -1942,7 +1930,7 @@
         </w:tc>
         <w:tc>
           <w:tcPr>
-            <w:tcW w:w="443" w:type="dxa"/>
+            <w:tcW w:w="440" w:type="dxa"/>
             <w:tcBorders>
               <w:top w:val="single" w:sz="2" w:space="0" w:color="000000"/>
               <w:left w:val="single" w:sz="2" w:space="0" w:color="000000"/>
@@ -1987,7 +1975,7 @@
         </w:trPr>
         <w:tc>
           <w:tcPr>
-            <w:tcW w:w="1043" w:type="dxa"/>
+            <w:tcW w:w="1042" w:type="dxa"/>
             <w:tcBorders>
               <w:left w:val="single" w:sz="2" w:space="0" w:color="000000"/>
               <w:bottom w:val="single" w:sz="2" w:space="0" w:color="000000"/>
@@ -2021,6 +2009,44 @@
                 <w14:ligatures w14:val="none"/>
               </w:rPr>
               <w:t>Resposta</w:t>
+            </w:r>
+          </w:p>
+        </w:tc>
+        <w:tc>
+          <w:tcPr>
+            <w:tcW w:w="444" w:type="dxa"/>
+            <w:tcBorders>
+              <w:left w:val="single" w:sz="2" w:space="0" w:color="000000"/>
+              <w:bottom w:val="single" w:sz="2" w:space="0" w:color="000000"/>
+            </w:tcBorders>
+            <w:vAlign w:val="center"/>
+          </w:tcPr>
+          <w:p>
+            <w:pPr>
+              <w:pStyle w:val="Normal"/>
+              <w:spacing w:lineRule="auto" w:line="240" w:before="0" w:after="0"/>
+              <w:ind w:hanging="181" w:left="181"/>
+              <w:jc w:val="both"/>
+              <w:rPr>
+                <w:rFonts w:ascii="Arial" w:hAnsi="Arial" w:eastAsia="Times New Roman" w:cs="Arial"/>
+                <w:b/>
+                <w:kern w:val="0"/>
+                <w:sz w:val="18"/>
+                <w:szCs w:val="18"/>
+                <w:lang w:val="pt-PT" w:eastAsia="pt-BR"/>
+                <w14:ligatures w14:val="none"/>
+              </w:rPr>
+            </w:pPr>
+            <w:r>
+              <w:rPr>
+                <w:rFonts w:eastAsia="Times New Roman" w:cs="Arial" w:ascii="Arial" w:hAnsi="Arial"/>
+                <w:b/>
+                <w:kern w:val="0"/>
+                <w:sz w:val="18"/>
+                <w:szCs w:val="18"/>
+                <w:lang w:val="pt-PT" w:eastAsia="pt-BR"/>
+                <w14:ligatures w14:val="none"/>
+              </w:rPr>
             </w:r>
           </w:p>
         </w:tc>
@@ -2050,7 +2076,91 @@
               </w:rPr>
             </w:pPr>
             <w:r>
-              <w:rPr/>
+              <w:rPr>
+                <w:rFonts w:eastAsia="Times New Roman" w:cs="Arial" w:ascii="Arial" w:hAnsi="Arial"/>
+                <w:b/>
+                <w:kern w:val="0"/>
+                <w:sz w:val="18"/>
+                <w:szCs w:val="18"/>
+                <w:lang w:val="pt-PT" w:eastAsia="pt-BR"/>
+                <w14:ligatures w14:val="none"/>
+              </w:rPr>
+            </w:r>
+          </w:p>
+        </w:tc>
+        <w:tc>
+          <w:tcPr>
+            <w:tcW w:w="442" w:type="dxa"/>
+            <w:tcBorders>
+              <w:left w:val="single" w:sz="2" w:space="0" w:color="000000"/>
+              <w:bottom w:val="single" w:sz="2" w:space="0" w:color="000000"/>
+            </w:tcBorders>
+            <w:vAlign w:val="center"/>
+          </w:tcPr>
+          <w:p>
+            <w:pPr>
+              <w:pStyle w:val="Normal"/>
+              <w:spacing w:lineRule="auto" w:line="240" w:before="0" w:after="0"/>
+              <w:ind w:hanging="181" w:left="181"/>
+              <w:jc w:val="both"/>
+              <w:rPr>
+                <w:rFonts w:ascii="Arial" w:hAnsi="Arial" w:eastAsia="Times New Roman" w:cs="Arial"/>
+                <w:b/>
+                <w:kern w:val="0"/>
+                <w:sz w:val="18"/>
+                <w:szCs w:val="18"/>
+                <w:lang w:val="pt-PT" w:eastAsia="pt-BR"/>
+                <w14:ligatures w14:val="none"/>
+              </w:rPr>
+            </w:pPr>
+            <w:r>
+              <w:rPr>
+                <w:rFonts w:eastAsia="Times New Roman" w:cs="Arial" w:ascii="Arial" w:hAnsi="Arial"/>
+                <w:b/>
+                <w:kern w:val="0"/>
+                <w:sz w:val="18"/>
+                <w:szCs w:val="18"/>
+                <w:lang w:val="pt-PT" w:eastAsia="pt-BR"/>
+                <w14:ligatures w14:val="none"/>
+              </w:rPr>
+            </w:r>
+          </w:p>
+        </w:tc>
+        <w:tc>
+          <w:tcPr>
+            <w:tcW w:w="444" w:type="dxa"/>
+            <w:tcBorders>
+              <w:left w:val="single" w:sz="2" w:space="0" w:color="000000"/>
+              <w:bottom w:val="single" w:sz="2" w:space="0" w:color="000000"/>
+            </w:tcBorders>
+            <w:vAlign w:val="center"/>
+          </w:tcPr>
+          <w:p>
+            <w:pPr>
+              <w:pStyle w:val="Normal"/>
+              <w:spacing w:lineRule="auto" w:line="240" w:before="0" w:after="0"/>
+              <w:ind w:hanging="181" w:left="181"/>
+              <w:jc w:val="both"/>
+              <w:rPr>
+                <w:rFonts w:ascii="Arial" w:hAnsi="Arial" w:eastAsia="Times New Roman" w:cs="Arial"/>
+                <w:b/>
+                <w:kern w:val="0"/>
+                <w:sz w:val="18"/>
+                <w:szCs w:val="18"/>
+                <w:lang w:val="pt-PT" w:eastAsia="pt-BR"/>
+                <w14:ligatures w14:val="none"/>
+              </w:rPr>
+            </w:pPr>
+            <w:r>
+              <w:rPr>
+                <w:rFonts w:eastAsia="Times New Roman" w:cs="Arial" w:ascii="Arial" w:hAnsi="Arial"/>
+                <w:b/>
+                <w:kern w:val="0"/>
+                <w:sz w:val="18"/>
+                <w:szCs w:val="18"/>
+                <w:lang w:val="pt-PT" w:eastAsia="pt-BR"/>
+                <w14:ligatures w14:val="none"/>
+              </w:rPr>
             </w:r>
           </w:p>
         </w:tc>
@@ -2080,7 +2190,91 @@
               </w:rPr>
             </w:pPr>
             <w:r>
-              <w:rPr/>
+              <w:rPr>
+                <w:rFonts w:eastAsia="Times New Roman" w:cs="Arial" w:ascii="Arial" w:hAnsi="Arial"/>
+                <w:b/>
+                <w:kern w:val="0"/>
+                <w:sz w:val="18"/>
+                <w:szCs w:val="18"/>
+                <w:lang w:val="pt-PT" w:eastAsia="pt-BR"/>
+                <w14:ligatures w14:val="none"/>
+              </w:rPr>
+            </w:r>
+          </w:p>
+        </w:tc>
+        <w:tc>
+          <w:tcPr>
+            <w:tcW w:w="442" w:type="dxa"/>
+            <w:tcBorders>
+              <w:left w:val="single" w:sz="2" w:space="0" w:color="000000"/>
+              <w:bottom w:val="single" w:sz="2" w:space="0" w:color="000000"/>
+            </w:tcBorders>
+            <w:vAlign w:val="center"/>
+          </w:tcPr>
+          <w:p>
+            <w:pPr>
+              <w:pStyle w:val="Normal"/>
+              <w:spacing w:lineRule="auto" w:line="240" w:before="0" w:after="0"/>
+              <w:ind w:hanging="181" w:left="181"/>
+              <w:jc w:val="both"/>
+              <w:rPr>
+                <w:rFonts w:ascii="Arial" w:hAnsi="Arial" w:eastAsia="Times New Roman" w:cs="Arial"/>
+                <w:b/>
+                <w:kern w:val="0"/>
+                <w:sz w:val="18"/>
+                <w:szCs w:val="18"/>
+                <w:lang w:val="pt-PT" w:eastAsia="pt-BR"/>
+                <w14:ligatures w14:val="none"/>
+              </w:rPr>
+            </w:pPr>
+            <w:r>
+              <w:rPr>
+                <w:rFonts w:eastAsia="Times New Roman" w:cs="Arial" w:ascii="Arial" w:hAnsi="Arial"/>
+                <w:b/>
+                <w:kern w:val="0"/>
+                <w:sz w:val="18"/>
+                <w:szCs w:val="18"/>
+                <w:lang w:val="pt-PT" w:eastAsia="pt-BR"/>
+                <w14:ligatures w14:val="none"/>
+              </w:rPr>
+            </w:r>
+          </w:p>
+        </w:tc>
+        <w:tc>
+          <w:tcPr>
+            <w:tcW w:w="444" w:type="dxa"/>
+            <w:tcBorders>
+              <w:left w:val="single" w:sz="2" w:space="0" w:color="000000"/>
+              <w:bottom w:val="single" w:sz="2" w:space="0" w:color="000000"/>
+            </w:tcBorders>
+            <w:vAlign w:val="center"/>
+          </w:tcPr>
+          <w:p>
+            <w:pPr>
+              <w:pStyle w:val="Normal"/>
+              <w:spacing w:lineRule="auto" w:line="240" w:before="0" w:after="0"/>
+              <w:ind w:hanging="181" w:left="181"/>
+              <w:jc w:val="both"/>
+              <w:rPr>
+                <w:rFonts w:ascii="Arial" w:hAnsi="Arial" w:eastAsia="Times New Roman" w:cs="Arial"/>
+                <w:b/>
+                <w:kern w:val="0"/>
+                <w:sz w:val="18"/>
+                <w:szCs w:val="18"/>
+                <w:lang w:val="pt-PT" w:eastAsia="pt-BR"/>
+                <w14:ligatures w14:val="none"/>
+              </w:rPr>
+            </w:pPr>
+            <w:r>
+              <w:rPr>
+                <w:rFonts w:eastAsia="Times New Roman" w:cs="Arial" w:ascii="Arial" w:hAnsi="Arial"/>
+                <w:b/>
+                <w:kern w:val="0"/>
+                <w:sz w:val="18"/>
+                <w:szCs w:val="18"/>
+                <w:lang w:val="pt-PT" w:eastAsia="pt-BR"/>
+                <w14:ligatures w14:val="none"/>
+              </w:rPr>
             </w:r>
           </w:p>
         </w:tc>
@@ -2110,7 +2304,91 @@
               </w:rPr>
             </w:pPr>
             <w:r>
-              <w:rPr/>
+              <w:rPr>
+                <w:rFonts w:eastAsia="Times New Roman" w:cs="Arial" w:ascii="Arial" w:hAnsi="Arial"/>
+                <w:b/>
+                <w:kern w:val="0"/>
+                <w:sz w:val="18"/>
+                <w:szCs w:val="18"/>
+                <w:lang w:val="pt-PT" w:eastAsia="pt-BR"/>
+                <w14:ligatures w14:val="none"/>
+              </w:rPr>
+            </w:r>
+          </w:p>
+        </w:tc>
+        <w:tc>
+          <w:tcPr>
+            <w:tcW w:w="442" w:type="dxa"/>
+            <w:tcBorders>
+              <w:left w:val="single" w:sz="2" w:space="0" w:color="000000"/>
+              <w:bottom w:val="single" w:sz="2" w:space="0" w:color="000000"/>
+            </w:tcBorders>
+            <w:vAlign w:val="center"/>
+          </w:tcPr>
+          <w:p>
+            <w:pPr>
+              <w:pStyle w:val="Normal"/>
+              <w:spacing w:lineRule="auto" w:line="240" w:before="0" w:after="0"/>
+              <w:ind w:hanging="181" w:left="181"/>
+              <w:jc w:val="both"/>
+              <w:rPr>
+                <w:rFonts w:ascii="Arial" w:hAnsi="Arial" w:eastAsia="Times New Roman" w:cs="Arial"/>
+                <w:b/>
+                <w:kern w:val="0"/>
+                <w:sz w:val="18"/>
+                <w:szCs w:val="18"/>
+                <w:lang w:val="pt-PT" w:eastAsia="pt-BR"/>
+                <w14:ligatures w14:val="none"/>
+              </w:rPr>
+            </w:pPr>
+            <w:r>
+              <w:rPr>
+                <w:rFonts w:eastAsia="Times New Roman" w:cs="Arial" w:ascii="Arial" w:hAnsi="Arial"/>
+                <w:b/>
+                <w:kern w:val="0"/>
+                <w:sz w:val="18"/>
+                <w:szCs w:val="18"/>
+                <w:lang w:val="pt-PT" w:eastAsia="pt-BR"/>
+                <w14:ligatures w14:val="none"/>
+              </w:rPr>
+            </w:r>
+          </w:p>
+        </w:tc>
+        <w:tc>
+          <w:tcPr>
+            <w:tcW w:w="444" w:type="dxa"/>
+            <w:tcBorders>
+              <w:left w:val="single" w:sz="2" w:space="0" w:color="000000"/>
+              <w:bottom w:val="single" w:sz="2" w:space="0" w:color="000000"/>
+            </w:tcBorders>
+            <w:vAlign w:val="center"/>
+          </w:tcPr>
+          <w:p>
+            <w:pPr>
+              <w:pStyle w:val="Normal"/>
+              <w:spacing w:lineRule="auto" w:line="240" w:before="0" w:after="0"/>
+              <w:ind w:hanging="181" w:left="181"/>
+              <w:jc w:val="both"/>
+              <w:rPr>
+                <w:rFonts w:ascii="Arial" w:hAnsi="Arial" w:eastAsia="Times New Roman" w:cs="Arial"/>
+                <w:b/>
+                <w:kern w:val="0"/>
+                <w:sz w:val="18"/>
+                <w:szCs w:val="18"/>
+                <w:lang w:val="pt-PT" w:eastAsia="pt-BR"/>
+                <w14:ligatures w14:val="none"/>
+              </w:rPr>
+            </w:pPr>
+            <w:r>
+              <w:rPr>
+                <w:rFonts w:eastAsia="Times New Roman" w:cs="Arial" w:ascii="Arial" w:hAnsi="Arial"/>
+                <w:b/>
+                <w:kern w:val="0"/>
+                <w:sz w:val="18"/>
+                <w:szCs w:val="18"/>
+                <w:lang w:val="pt-PT" w:eastAsia="pt-BR"/>
+                <w14:ligatures w14:val="none"/>
+              </w:rPr>
             </w:r>
           </w:p>
         </w:tc>
@@ -2140,7 +2418,91 @@
               </w:rPr>
             </w:pPr>
             <w:r>
-              <w:rPr/>
+              <w:rPr>
+                <w:rFonts w:eastAsia="Times New Roman" w:cs="Arial" w:ascii="Arial" w:hAnsi="Arial"/>
+                <w:b/>
+                <w:kern w:val="0"/>
+                <w:sz w:val="18"/>
+                <w:szCs w:val="18"/>
+                <w:lang w:val="pt-PT" w:eastAsia="pt-BR"/>
+                <w14:ligatures w14:val="none"/>
+              </w:rPr>
+            </w:r>
+          </w:p>
+        </w:tc>
+        <w:tc>
+          <w:tcPr>
+            <w:tcW w:w="442" w:type="dxa"/>
+            <w:tcBorders>
+              <w:left w:val="single" w:sz="2" w:space="0" w:color="000000"/>
+              <w:bottom w:val="single" w:sz="2" w:space="0" w:color="000000"/>
+            </w:tcBorders>
+            <w:vAlign w:val="center"/>
+          </w:tcPr>
+          <w:p>
+            <w:pPr>
+              <w:pStyle w:val="Normal"/>
+              <w:spacing w:lineRule="auto" w:line="240" w:before="0" w:after="0"/>
+              <w:ind w:hanging="181" w:left="181"/>
+              <w:jc w:val="both"/>
+              <w:rPr>
+                <w:rFonts w:ascii="Arial" w:hAnsi="Arial" w:eastAsia="Times New Roman" w:cs="Arial"/>
+                <w:b/>
+                <w:kern w:val="0"/>
+                <w:sz w:val="18"/>
+                <w:szCs w:val="18"/>
+                <w:lang w:val="pt-PT" w:eastAsia="pt-BR"/>
+                <w14:ligatures w14:val="none"/>
+              </w:rPr>
+            </w:pPr>
+            <w:r>
+              <w:rPr>
+                <w:rFonts w:eastAsia="Times New Roman" w:cs="Arial" w:ascii="Arial" w:hAnsi="Arial"/>
+                <w:b/>
+                <w:kern w:val="0"/>
+                <w:sz w:val="18"/>
+                <w:szCs w:val="18"/>
+                <w:lang w:val="pt-PT" w:eastAsia="pt-BR"/>
+                <w14:ligatures w14:val="none"/>
+              </w:rPr>
+            </w:r>
+          </w:p>
+        </w:tc>
+        <w:tc>
+          <w:tcPr>
+            <w:tcW w:w="444" w:type="dxa"/>
+            <w:tcBorders>
+              <w:left w:val="single" w:sz="2" w:space="0" w:color="000000"/>
+              <w:bottom w:val="single" w:sz="2" w:space="0" w:color="000000"/>
+            </w:tcBorders>
+            <w:vAlign w:val="center"/>
+          </w:tcPr>
+          <w:p>
+            <w:pPr>
+              <w:pStyle w:val="Normal"/>
+              <w:spacing w:lineRule="auto" w:line="240" w:before="0" w:after="0"/>
+              <w:ind w:hanging="181" w:left="181"/>
+              <w:jc w:val="both"/>
+              <w:rPr>
+                <w:rFonts w:ascii="Arial" w:hAnsi="Arial" w:eastAsia="Times New Roman" w:cs="Arial"/>
+                <w:b/>
+                <w:kern w:val="0"/>
+                <w:sz w:val="18"/>
+                <w:szCs w:val="18"/>
+                <w:lang w:val="pt-PT" w:eastAsia="pt-BR"/>
+                <w14:ligatures w14:val="none"/>
+              </w:rPr>
+            </w:pPr>
+            <w:r>
+              <w:rPr>
+                <w:rFonts w:eastAsia="Times New Roman" w:cs="Arial" w:ascii="Arial" w:hAnsi="Arial"/>
+                <w:b/>
+                <w:kern w:val="0"/>
+                <w:sz w:val="18"/>
+                <w:szCs w:val="18"/>
+                <w:lang w:val="pt-PT" w:eastAsia="pt-BR"/>
+                <w14:ligatures w14:val="none"/>
+              </w:rPr>
             </w:r>
           </w:p>
         </w:tc>
@@ -2170,7 +2532,91 @@
               </w:rPr>
             </w:pPr>
             <w:r>
-              <w:rPr/>
+              <w:rPr>
+                <w:rFonts w:eastAsia="Times New Roman" w:cs="Arial" w:ascii="Arial" w:hAnsi="Arial"/>
+                <w:b/>
+                <w:kern w:val="0"/>
+                <w:sz w:val="18"/>
+                <w:szCs w:val="18"/>
+                <w:lang w:val="pt-PT" w:eastAsia="pt-BR"/>
+                <w14:ligatures w14:val="none"/>
+              </w:rPr>
+            </w:r>
+          </w:p>
+        </w:tc>
+        <w:tc>
+          <w:tcPr>
+            <w:tcW w:w="442" w:type="dxa"/>
+            <w:tcBorders>
+              <w:left w:val="single" w:sz="2" w:space="0" w:color="000000"/>
+              <w:bottom w:val="single" w:sz="2" w:space="0" w:color="000000"/>
+            </w:tcBorders>
+            <w:vAlign w:val="center"/>
+          </w:tcPr>
+          <w:p>
+            <w:pPr>
+              <w:pStyle w:val="Normal"/>
+              <w:spacing w:lineRule="auto" w:line="240" w:before="0" w:after="0"/>
+              <w:ind w:hanging="181" w:left="181"/>
+              <w:jc w:val="both"/>
+              <w:rPr>
+                <w:rFonts w:ascii="Arial" w:hAnsi="Arial" w:eastAsia="Times New Roman" w:cs="Arial"/>
+                <w:b/>
+                <w:kern w:val="0"/>
+                <w:sz w:val="18"/>
+                <w:szCs w:val="18"/>
+                <w:lang w:val="pt-PT" w:eastAsia="pt-BR"/>
+                <w14:ligatures w14:val="none"/>
+              </w:rPr>
+            </w:pPr>
+            <w:r>
+              <w:rPr>
+                <w:rFonts w:eastAsia="Times New Roman" w:cs="Arial" w:ascii="Arial" w:hAnsi="Arial"/>
+                <w:b/>
+                <w:kern w:val="0"/>
+                <w:sz w:val="18"/>
+                <w:szCs w:val="18"/>
+                <w:lang w:val="pt-PT" w:eastAsia="pt-BR"/>
+                <w14:ligatures w14:val="none"/>
+              </w:rPr>
+            </w:r>
+          </w:p>
+        </w:tc>
+        <w:tc>
+          <w:tcPr>
+            <w:tcW w:w="444" w:type="dxa"/>
+            <w:tcBorders>
+              <w:left w:val="single" w:sz="2" w:space="0" w:color="000000"/>
+              <w:bottom w:val="single" w:sz="2" w:space="0" w:color="000000"/>
+            </w:tcBorders>
+            <w:vAlign w:val="center"/>
+          </w:tcPr>
+          <w:p>
+            <w:pPr>
+              <w:pStyle w:val="Normal"/>
+              <w:spacing w:lineRule="auto" w:line="240" w:before="0" w:after="0"/>
+              <w:ind w:hanging="181" w:left="181"/>
+              <w:jc w:val="both"/>
+              <w:rPr>
+                <w:rFonts w:ascii="Arial" w:hAnsi="Arial" w:eastAsia="Times New Roman" w:cs="Arial"/>
+                <w:b/>
+                <w:kern w:val="0"/>
+                <w:sz w:val="18"/>
+                <w:szCs w:val="18"/>
+                <w:lang w:val="pt-PT" w:eastAsia="pt-BR"/>
+                <w14:ligatures w14:val="none"/>
+              </w:rPr>
+            </w:pPr>
+            <w:r>
+              <w:rPr>
+                <w:rFonts w:eastAsia="Times New Roman" w:cs="Arial" w:ascii="Arial" w:hAnsi="Arial"/>
+                <w:b/>
+                <w:kern w:val="0"/>
+                <w:sz w:val="18"/>
+                <w:szCs w:val="18"/>
+                <w:lang w:val="pt-PT" w:eastAsia="pt-BR"/>
+                <w14:ligatures w14:val="none"/>
+              </w:rPr>
             </w:r>
           </w:p>
         </w:tc>
@@ -2200,13 +2646,21 @@
               </w:rPr>
             </w:pPr>
             <w:r>
-              <w:rPr/>
+              <w:rPr>
+                <w:rFonts w:eastAsia="Times New Roman" w:cs="Arial" w:ascii="Arial" w:hAnsi="Arial"/>
+                <w:b/>
+                <w:kern w:val="0"/>
+                <w:sz w:val="18"/>
+                <w:szCs w:val="18"/>
+                <w:lang w:val="pt-PT" w:eastAsia="pt-BR"/>
+                <w14:ligatures w14:val="none"/>
+              </w:rPr>
             </w:r>
           </w:p>
         </w:tc>
         <w:tc>
           <w:tcPr>
-            <w:tcW w:w="443" w:type="dxa"/>
+            <w:tcW w:w="442" w:type="dxa"/>
             <w:tcBorders>
               <w:left w:val="single" w:sz="2" w:space="0" w:color="000000"/>
               <w:bottom w:val="single" w:sz="2" w:space="0" w:color="000000"/>
@@ -2230,343 +2684,21 @@
               </w:rPr>
             </w:pPr>
             <w:r>
-              <w:rPr/>
+              <w:rPr>
+                <w:rFonts w:eastAsia="Times New Roman" w:cs="Arial" w:ascii="Arial" w:hAnsi="Arial"/>
+                <w:b/>
+                <w:kern w:val="0"/>
+                <w:sz w:val="18"/>
+                <w:szCs w:val="18"/>
+                <w:lang w:val="pt-PT" w:eastAsia="pt-BR"/>
+                <w14:ligatures w14:val="none"/>
+              </w:rPr>
             </w:r>
           </w:p>
         </w:tc>
         <w:tc>
           <w:tcPr>
-            <w:tcW w:w="443" w:type="dxa"/>
-            <w:tcBorders>
-              <w:left w:val="single" w:sz="2" w:space="0" w:color="000000"/>
-              <w:bottom w:val="single" w:sz="2" w:space="0" w:color="000000"/>
-            </w:tcBorders>
-            <w:vAlign w:val="center"/>
-          </w:tcPr>
-          <w:p>
-            <w:pPr>
-              <w:pStyle w:val="Normal"/>
-              <w:spacing w:lineRule="auto" w:line="240" w:before="0" w:after="0"/>
-              <w:ind w:hanging="181" w:left="181"/>
-              <w:jc w:val="both"/>
-              <w:rPr>
-                <w:rFonts w:ascii="Arial" w:hAnsi="Arial" w:eastAsia="Times New Roman" w:cs="Arial"/>
-                <w:b/>
-                <w:kern w:val="0"/>
-                <w:sz w:val="18"/>
-                <w:szCs w:val="18"/>
-                <w:lang w:val="pt-PT" w:eastAsia="pt-BR"/>
-                <w14:ligatures w14:val="none"/>
-              </w:rPr>
-            </w:pPr>
-            <w:r>
-              <w:rPr/>
-            </w:r>
-          </w:p>
-        </w:tc>
-        <w:tc>
-          <w:tcPr>
-            <w:tcW w:w="443" w:type="dxa"/>
-            <w:tcBorders>
-              <w:left w:val="single" w:sz="2" w:space="0" w:color="000000"/>
-              <w:bottom w:val="single" w:sz="2" w:space="0" w:color="000000"/>
-            </w:tcBorders>
-            <w:vAlign w:val="center"/>
-          </w:tcPr>
-          <w:p>
-            <w:pPr>
-              <w:pStyle w:val="Normal"/>
-              <w:spacing w:lineRule="auto" w:line="240" w:before="0" w:after="0"/>
-              <w:ind w:hanging="181" w:left="181"/>
-              <w:jc w:val="both"/>
-              <w:rPr>
-                <w:rFonts w:ascii="Arial" w:hAnsi="Arial" w:eastAsia="Times New Roman" w:cs="Arial"/>
-                <w:b/>
-                <w:kern w:val="0"/>
-                <w:sz w:val="18"/>
-                <w:szCs w:val="18"/>
-                <w:lang w:val="pt-PT" w:eastAsia="pt-BR"/>
-                <w14:ligatures w14:val="none"/>
-              </w:rPr>
-            </w:pPr>
-            <w:r>
-              <w:rPr/>
-            </w:r>
-          </w:p>
-        </w:tc>
-        <w:tc>
-          <w:tcPr>
-            <w:tcW w:w="443" w:type="dxa"/>
-            <w:tcBorders>
-              <w:left w:val="single" w:sz="2" w:space="0" w:color="000000"/>
-              <w:bottom w:val="single" w:sz="2" w:space="0" w:color="000000"/>
-            </w:tcBorders>
-            <w:vAlign w:val="center"/>
-          </w:tcPr>
-          <w:p>
-            <w:pPr>
-              <w:pStyle w:val="Normal"/>
-              <w:spacing w:lineRule="auto" w:line="240" w:before="0" w:after="0"/>
-              <w:ind w:hanging="181" w:left="181"/>
-              <w:jc w:val="both"/>
-              <w:rPr>
-                <w:rFonts w:ascii="Arial" w:hAnsi="Arial" w:eastAsia="Times New Roman" w:cs="Arial"/>
-                <w:b/>
-                <w:kern w:val="0"/>
-                <w:sz w:val="18"/>
-                <w:szCs w:val="18"/>
-                <w:lang w:val="pt-PT" w:eastAsia="pt-BR"/>
-                <w14:ligatures w14:val="none"/>
-              </w:rPr>
-            </w:pPr>
-            <w:r>
-              <w:rPr/>
-            </w:r>
-          </w:p>
-        </w:tc>
-        <w:tc>
-          <w:tcPr>
-            <w:tcW w:w="443" w:type="dxa"/>
-            <w:tcBorders>
-              <w:left w:val="single" w:sz="2" w:space="0" w:color="000000"/>
-              <w:bottom w:val="single" w:sz="2" w:space="0" w:color="000000"/>
-            </w:tcBorders>
-            <w:vAlign w:val="center"/>
-          </w:tcPr>
-          <w:p>
-            <w:pPr>
-              <w:pStyle w:val="Normal"/>
-              <w:spacing w:lineRule="auto" w:line="240" w:before="0" w:after="0"/>
-              <w:ind w:hanging="181" w:left="181"/>
-              <w:jc w:val="both"/>
-              <w:rPr>
-                <w:rFonts w:ascii="Arial" w:hAnsi="Arial" w:eastAsia="Times New Roman" w:cs="Arial"/>
-                <w:b/>
-                <w:kern w:val="0"/>
-                <w:sz w:val="18"/>
-                <w:szCs w:val="18"/>
-                <w:lang w:val="pt-PT" w:eastAsia="pt-BR"/>
-                <w14:ligatures w14:val="none"/>
-              </w:rPr>
-            </w:pPr>
-            <w:r>
-              <w:rPr/>
-            </w:r>
-          </w:p>
-        </w:tc>
-        <w:tc>
-          <w:tcPr>
-            <w:tcW w:w="443" w:type="dxa"/>
-            <w:tcBorders>
-              <w:left w:val="single" w:sz="2" w:space="0" w:color="000000"/>
-              <w:bottom w:val="single" w:sz="2" w:space="0" w:color="000000"/>
-            </w:tcBorders>
-            <w:vAlign w:val="center"/>
-          </w:tcPr>
-          <w:p>
-            <w:pPr>
-              <w:pStyle w:val="Normal"/>
-              <w:spacing w:lineRule="auto" w:line="240" w:before="0" w:after="0"/>
-              <w:ind w:hanging="181" w:left="181"/>
-              <w:jc w:val="both"/>
-              <w:rPr>
-                <w:rFonts w:ascii="Arial" w:hAnsi="Arial" w:eastAsia="Times New Roman" w:cs="Arial"/>
-                <w:b/>
-                <w:kern w:val="0"/>
-                <w:sz w:val="18"/>
-                <w:szCs w:val="18"/>
-                <w:lang w:val="pt-PT" w:eastAsia="pt-BR"/>
-                <w14:ligatures w14:val="none"/>
-              </w:rPr>
-            </w:pPr>
-            <w:r>
-              <w:rPr/>
-            </w:r>
-          </w:p>
-        </w:tc>
-        <w:tc>
-          <w:tcPr>
-            <w:tcW w:w="443" w:type="dxa"/>
-            <w:tcBorders>
-              <w:left w:val="single" w:sz="2" w:space="0" w:color="000000"/>
-              <w:bottom w:val="single" w:sz="2" w:space="0" w:color="000000"/>
-            </w:tcBorders>
-            <w:vAlign w:val="center"/>
-          </w:tcPr>
-          <w:p>
-            <w:pPr>
-              <w:pStyle w:val="Normal"/>
-              <w:spacing w:lineRule="auto" w:line="240" w:before="0" w:after="0"/>
-              <w:ind w:hanging="181" w:left="181"/>
-              <w:jc w:val="both"/>
-              <w:rPr>
-                <w:rFonts w:ascii="Arial" w:hAnsi="Arial" w:eastAsia="Times New Roman" w:cs="Arial"/>
-                <w:b/>
-                <w:kern w:val="0"/>
-                <w:sz w:val="18"/>
-                <w:szCs w:val="18"/>
-                <w:lang w:val="pt-PT" w:eastAsia="pt-BR"/>
-                <w14:ligatures w14:val="none"/>
-              </w:rPr>
-            </w:pPr>
-            <w:r>
-              <w:rPr/>
-            </w:r>
-          </w:p>
-        </w:tc>
-        <w:tc>
-          <w:tcPr>
-            <w:tcW w:w="443" w:type="dxa"/>
-            <w:tcBorders>
-              <w:left w:val="single" w:sz="2" w:space="0" w:color="000000"/>
-              <w:bottom w:val="single" w:sz="2" w:space="0" w:color="000000"/>
-            </w:tcBorders>
-            <w:vAlign w:val="center"/>
-          </w:tcPr>
-          <w:p>
-            <w:pPr>
-              <w:pStyle w:val="Normal"/>
-              <w:spacing w:lineRule="auto" w:line="240" w:before="0" w:after="0"/>
-              <w:ind w:hanging="181" w:left="181"/>
-              <w:jc w:val="both"/>
-              <w:rPr>
-                <w:rFonts w:ascii="Arial" w:hAnsi="Arial" w:eastAsia="Times New Roman" w:cs="Arial"/>
-                <w:b/>
-                <w:kern w:val="0"/>
-                <w:sz w:val="18"/>
-                <w:szCs w:val="18"/>
-                <w:lang w:val="pt-PT" w:eastAsia="pt-BR"/>
-                <w14:ligatures w14:val="none"/>
-              </w:rPr>
-            </w:pPr>
-            <w:r>
-              <w:rPr/>
-            </w:r>
-          </w:p>
-        </w:tc>
-        <w:tc>
-          <w:tcPr>
-            <w:tcW w:w="443" w:type="dxa"/>
-            <w:tcBorders>
-              <w:left w:val="single" w:sz="2" w:space="0" w:color="000000"/>
-              <w:bottom w:val="single" w:sz="2" w:space="0" w:color="000000"/>
-            </w:tcBorders>
-            <w:vAlign w:val="center"/>
-          </w:tcPr>
-          <w:p>
-            <w:pPr>
-              <w:pStyle w:val="Normal"/>
-              <w:spacing w:lineRule="auto" w:line="240" w:before="0" w:after="0"/>
-              <w:ind w:hanging="181" w:left="181"/>
-              <w:jc w:val="both"/>
-              <w:rPr>
-                <w:rFonts w:ascii="Arial" w:hAnsi="Arial" w:eastAsia="Times New Roman" w:cs="Arial"/>
-                <w:b/>
-                <w:kern w:val="0"/>
-                <w:sz w:val="18"/>
-                <w:szCs w:val="18"/>
-                <w:lang w:val="pt-PT" w:eastAsia="pt-BR"/>
-                <w14:ligatures w14:val="none"/>
-              </w:rPr>
-            </w:pPr>
-            <w:r>
-              <w:rPr/>
-            </w:r>
-          </w:p>
-        </w:tc>
-        <w:tc>
-          <w:tcPr>
-            <w:tcW w:w="443" w:type="dxa"/>
-            <w:tcBorders>
-              <w:left w:val="single" w:sz="2" w:space="0" w:color="000000"/>
-              <w:bottom w:val="single" w:sz="2" w:space="0" w:color="000000"/>
-            </w:tcBorders>
-            <w:vAlign w:val="center"/>
-          </w:tcPr>
-          <w:p>
-            <w:pPr>
-              <w:pStyle w:val="Normal"/>
-              <w:spacing w:lineRule="auto" w:line="240" w:before="0" w:after="0"/>
-              <w:ind w:hanging="181" w:left="181"/>
-              <w:jc w:val="both"/>
-              <w:rPr>
-                <w:rFonts w:ascii="Arial" w:hAnsi="Arial" w:eastAsia="Times New Roman" w:cs="Arial"/>
-                <w:b/>
-                <w:kern w:val="0"/>
-                <w:sz w:val="18"/>
-                <w:szCs w:val="18"/>
-                <w:lang w:val="pt-PT" w:eastAsia="pt-BR"/>
-                <w14:ligatures w14:val="none"/>
-              </w:rPr>
-            </w:pPr>
-            <w:r>
-              <w:rPr/>
-            </w:r>
-          </w:p>
-        </w:tc>
-        <w:tc>
-          <w:tcPr>
-            <w:tcW w:w="443" w:type="dxa"/>
-            <w:tcBorders>
-              <w:left w:val="single" w:sz="2" w:space="0" w:color="000000"/>
-              <w:bottom w:val="single" w:sz="2" w:space="0" w:color="000000"/>
-            </w:tcBorders>
-            <w:vAlign w:val="center"/>
-          </w:tcPr>
-          <w:p>
-            <w:pPr>
-              <w:pStyle w:val="Normal"/>
-              <w:spacing w:lineRule="auto" w:line="240" w:before="0" w:after="0"/>
-              <w:ind w:hanging="181" w:left="181"/>
-              <w:jc w:val="both"/>
-              <w:rPr>
-                <w:rFonts w:ascii="Arial" w:hAnsi="Arial" w:eastAsia="Times New Roman" w:cs="Arial"/>
-                <w:b/>
-                <w:kern w:val="0"/>
-                <w:sz w:val="18"/>
-                <w:szCs w:val="18"/>
-                <w:lang w:val="pt-PT" w:eastAsia="pt-BR"/>
-                <w14:ligatures w14:val="none"/>
-              </w:rPr>
-            </w:pPr>
-            <w:r>
-              <w:rPr/>
-            </w:r>
-          </w:p>
-        </w:tc>
-        <w:tc>
-          <w:tcPr>
-            <w:tcW w:w="443" w:type="dxa"/>
-            <w:tcBorders>
-              <w:left w:val="single" w:sz="2" w:space="0" w:color="000000"/>
-              <w:bottom w:val="single" w:sz="2" w:space="0" w:color="000000"/>
-            </w:tcBorders>
-            <w:vAlign w:val="center"/>
-          </w:tcPr>
-          <w:p>
-            <w:pPr>
-              <w:pStyle w:val="Normal"/>
-              <w:spacing w:lineRule="auto" w:line="240" w:before="0" w:after="0"/>
-              <w:ind w:hanging="181" w:left="181"/>
-              <w:jc w:val="both"/>
-              <w:rPr>
-                <w:rFonts w:ascii="Arial" w:hAnsi="Arial" w:eastAsia="Times New Roman" w:cs="Arial"/>
-                <w:b/>
-                <w:kern w:val="0"/>
-                <w:sz w:val="18"/>
-                <w:szCs w:val="18"/>
-                <w:lang w:val="pt-PT" w:eastAsia="pt-BR"/>
-                <w14:ligatures w14:val="none"/>
-              </w:rPr>
-            </w:pPr>
-            <w:r>
-              <w:rPr/>
-            </w:r>
-          </w:p>
-        </w:tc>
-        <w:tc>
-          <w:tcPr>
-            <w:tcW w:w="443" w:type="dxa"/>
+            <w:tcW w:w="444" w:type="dxa"/>
             <w:tcBorders>
               <w:left w:val="single" w:sz="2" w:space="0" w:color="000000"/>
               <w:bottom w:val="single" w:sz="2" w:space="0" w:color="000000"/>
@@ -2588,7 +2720,7 @@
         </w:tc>
         <w:tc>
           <w:tcPr>
-            <w:tcW w:w="443" w:type="dxa"/>
+            <w:tcW w:w="440" w:type="dxa"/>
             <w:tcBorders>
               <w:left w:val="single" w:sz="2" w:space="0" w:color="000000"/>
               <w:bottom w:val="single" w:sz="2" w:space="0" w:color="000000"/>
@@ -2631,10 +2763,13 @@
       </w:pPr>
       <w:r>
         <w:rPr>
-          <w:rFonts w:cs="Arial" w:ascii="Arial Narrow" w:hAnsi="Arial Narrow"/>
-          <w:b/>
-          <w:bCs/>
-          <w:color w:themeColor="text1" w:val="000000"/>
+          <w:rFonts w:eastAsia="Times New Roman" w:cs="Arial" w:ascii="Arial" w:hAnsi="Arial"/>
+          <w:i/>
+          <w:kern w:val="0"/>
+          <w:sz w:val="16"/>
+          <w:szCs w:val="16"/>
+          <w:lang w:eastAsia="pt-BR"/>
+          <w14:ligatures w14:val="none"/>
         </w:rPr>
       </w:r>
     </w:p>

</xml_diff>

<commit_message>
feat(versoes): atualiza símbolos de identificação das 8 versões de prova
Troca os símbolos usados no rodapé dos templates AF e AFZ:
A=-- B=** C=== D=++ E=|| F=## G=// H=!!

Co-Authored-By: Claude Sonnet 4.6 <noreply@anthropic.com>
</commit_message>
<xml_diff>
--- a/Modelo_AF.docx
+++ b/Modelo_AF.docx
@@ -623,30 +623,6 @@
           <w:lang w:val="pt-PT" w:eastAsia="pt-BR"/>
           <w14:ligatures w14:val="none"/>
         </w:rPr>
-        <w:t>A1</w:t>
-      </w:r>
-      <w:r>
-        <w:rPr>
-          <w:rFonts w:eastAsia="Times New Roman" w:cs="Arial" w:ascii="Arial" w:hAnsi="Arial"/>
-          <w:color w:val="000000"/>
-          <w:spacing w:val="-4"/>
-          <w:kern w:val="2"/>
-          <w:shd w:fill="D9D9D9" w:val="clear"/>
-          <w:lang w:val="pt-PT" w:eastAsia="pt-BR"/>
-          <w14:ligatures w14:val="none"/>
-        </w:rPr>
-        <w:t xml:space="preserve"> </w:t>
-      </w:r>
-      <w:r>
-        <w:rPr>
-          <w:rFonts w:eastAsia="Times New Roman" w:cs="Arial" w:ascii="Arial" w:hAnsi="Arial"/>
-          <w:color w:val="000000"/>
-          <w:spacing w:val="-2"/>
-          <w:kern w:val="2"/>
-          <w:shd w:fill="D9D9D9" w:val="clear"/>
-          <w:lang w:val="pt-PT" w:eastAsia="pt-BR"/>
-          <w14:ligatures w14:val="none"/>
-        </w:rPr>
         <w:t>{{simbolo aqui}}</w:t>
       </w:r>
       <w:r>
@@ -1132,22 +1108,22 @@
         <w:gridCol w:w="443"/>
         <w:gridCol w:w="442"/>
         <w:gridCol w:w="444"/>
+        <w:gridCol w:w="444"/>
+        <w:gridCol w:w="441"/>
+        <w:gridCol w:w="445"/>
+        <w:gridCol w:w="443"/>
+        <w:gridCol w:w="442"/>
+        <w:gridCol w:w="444"/>
+        <w:gridCol w:w="444"/>
+        <w:gridCol w:w="441"/>
+        <w:gridCol w:w="445"/>
         <w:gridCol w:w="443"/>
         <w:gridCol w:w="442"/>
         <w:gridCol w:w="444"/>
         <w:gridCol w:w="443"/>
         <w:gridCol w:w="442"/>
-        <w:gridCol w:w="444"/>
-        <w:gridCol w:w="443"/>
-        <w:gridCol w:w="442"/>
-        <w:gridCol w:w="444"/>
-        <w:gridCol w:w="443"/>
-        <w:gridCol w:w="442"/>
-        <w:gridCol w:w="444"/>
-        <w:gridCol w:w="443"/>
-        <w:gridCol w:w="442"/>
-        <w:gridCol w:w="444"/>
-        <w:gridCol w:w="440"/>
+        <w:gridCol w:w="445"/>
+        <w:gridCol w:w="437"/>
       </w:tblGrid>
       <w:tr>
         <w:trPr>
@@ -1345,7 +1321,7 @@
         </w:tc>
         <w:tc>
           <w:tcPr>
-            <w:tcW w:w="443" w:type="dxa"/>
+            <w:tcW w:w="444" w:type="dxa"/>
             <w:tcBorders>
               <w:top w:val="single" w:sz="2" w:space="0" w:color="000000"/>
               <w:left w:val="single" w:sz="2" w:space="0" w:color="000000"/>
@@ -1384,7 +1360,7 @@
         </w:tc>
         <w:tc>
           <w:tcPr>
-            <w:tcW w:w="442" w:type="dxa"/>
+            <w:tcW w:w="441" w:type="dxa"/>
             <w:tcBorders>
               <w:top w:val="single" w:sz="2" w:space="0" w:color="000000"/>
               <w:left w:val="single" w:sz="2" w:space="0" w:color="000000"/>
@@ -1423,7 +1399,7 @@
         </w:tc>
         <w:tc>
           <w:tcPr>
-            <w:tcW w:w="444" w:type="dxa"/>
+            <w:tcW w:w="445" w:type="dxa"/>
             <w:tcBorders>
               <w:top w:val="single" w:sz="2" w:space="0" w:color="000000"/>
               <w:left w:val="single" w:sz="2" w:space="0" w:color="000000"/>
@@ -1579,7 +1555,7 @@
         </w:tc>
         <w:tc>
           <w:tcPr>
-            <w:tcW w:w="443" w:type="dxa"/>
+            <w:tcW w:w="444" w:type="dxa"/>
             <w:tcBorders>
               <w:top w:val="single" w:sz="2" w:space="0" w:color="000000"/>
               <w:left w:val="single" w:sz="2" w:space="0" w:color="000000"/>
@@ -1618,7 +1594,7 @@
         </w:tc>
         <w:tc>
           <w:tcPr>
-            <w:tcW w:w="442" w:type="dxa"/>
+            <w:tcW w:w="441" w:type="dxa"/>
             <w:tcBorders>
               <w:top w:val="single" w:sz="2" w:space="0" w:color="000000"/>
               <w:left w:val="single" w:sz="2" w:space="0" w:color="000000"/>
@@ -1657,7 +1633,7 @@
         </w:tc>
         <w:tc>
           <w:tcPr>
-            <w:tcW w:w="444" w:type="dxa"/>
+            <w:tcW w:w="445" w:type="dxa"/>
             <w:tcBorders>
               <w:top w:val="single" w:sz="2" w:space="0" w:color="000000"/>
               <w:left w:val="single" w:sz="2" w:space="0" w:color="000000"/>
@@ -1891,7 +1867,7 @@
         </w:tc>
         <w:tc>
           <w:tcPr>
-            <w:tcW w:w="444" w:type="dxa"/>
+            <w:tcW w:w="445" w:type="dxa"/>
             <w:tcBorders>
               <w:top w:val="single" w:sz="2" w:space="0" w:color="000000"/>
               <w:left w:val="single" w:sz="2" w:space="0" w:color="000000"/>
@@ -1930,7 +1906,7 @@
         </w:tc>
         <w:tc>
           <w:tcPr>
-            <w:tcW w:w="440" w:type="dxa"/>
+            <w:tcW w:w="437" w:type="dxa"/>
             <w:tcBorders>
               <w:top w:val="single" w:sz="2" w:space="0" w:color="000000"/>
               <w:left w:val="single" w:sz="2" w:space="0" w:color="000000"/>
@@ -2166,6 +2142,120 @@
         </w:tc>
         <w:tc>
           <w:tcPr>
+            <w:tcW w:w="444" w:type="dxa"/>
+            <w:tcBorders>
+              <w:left w:val="single" w:sz="2" w:space="0" w:color="000000"/>
+              <w:bottom w:val="single" w:sz="2" w:space="0" w:color="000000"/>
+            </w:tcBorders>
+            <w:vAlign w:val="center"/>
+          </w:tcPr>
+          <w:p>
+            <w:pPr>
+              <w:pStyle w:val="Normal"/>
+              <w:spacing w:lineRule="auto" w:line="240" w:before="0" w:after="0"/>
+              <w:ind w:hanging="181" w:left="181"/>
+              <w:jc w:val="both"/>
+              <w:rPr>
+                <w:rFonts w:ascii="Arial" w:hAnsi="Arial" w:eastAsia="Times New Roman" w:cs="Arial"/>
+                <w:b/>
+                <w:kern w:val="0"/>
+                <w:sz w:val="18"/>
+                <w:szCs w:val="18"/>
+                <w:lang w:val="pt-PT" w:eastAsia="pt-BR"/>
+                <w14:ligatures w14:val="none"/>
+              </w:rPr>
+            </w:pPr>
+            <w:r>
+              <w:rPr>
+                <w:rFonts w:eastAsia="Times New Roman" w:cs="Arial" w:ascii="Arial" w:hAnsi="Arial"/>
+                <w:b/>
+                <w:kern w:val="0"/>
+                <w:sz w:val="18"/>
+                <w:szCs w:val="18"/>
+                <w:lang w:val="pt-PT" w:eastAsia="pt-BR"/>
+                <w14:ligatures w14:val="none"/>
+              </w:rPr>
+            </w:r>
+          </w:p>
+        </w:tc>
+        <w:tc>
+          <w:tcPr>
+            <w:tcW w:w="441" w:type="dxa"/>
+            <w:tcBorders>
+              <w:left w:val="single" w:sz="2" w:space="0" w:color="000000"/>
+              <w:bottom w:val="single" w:sz="2" w:space="0" w:color="000000"/>
+            </w:tcBorders>
+            <w:vAlign w:val="center"/>
+          </w:tcPr>
+          <w:p>
+            <w:pPr>
+              <w:pStyle w:val="Normal"/>
+              <w:spacing w:lineRule="auto" w:line="240" w:before="0" w:after="0"/>
+              <w:ind w:hanging="181" w:left="181"/>
+              <w:jc w:val="both"/>
+              <w:rPr>
+                <w:rFonts w:ascii="Arial" w:hAnsi="Arial" w:eastAsia="Times New Roman" w:cs="Arial"/>
+                <w:b/>
+                <w:kern w:val="0"/>
+                <w:sz w:val="18"/>
+                <w:szCs w:val="18"/>
+                <w:lang w:val="pt-PT" w:eastAsia="pt-BR"/>
+                <w14:ligatures w14:val="none"/>
+              </w:rPr>
+            </w:pPr>
+            <w:r>
+              <w:rPr>
+                <w:rFonts w:eastAsia="Times New Roman" w:cs="Arial" w:ascii="Arial" w:hAnsi="Arial"/>
+                <w:b/>
+                <w:kern w:val="0"/>
+                <w:sz w:val="18"/>
+                <w:szCs w:val="18"/>
+                <w:lang w:val="pt-PT" w:eastAsia="pt-BR"/>
+                <w14:ligatures w14:val="none"/>
+              </w:rPr>
+            </w:r>
+          </w:p>
+        </w:tc>
+        <w:tc>
+          <w:tcPr>
+            <w:tcW w:w="445" w:type="dxa"/>
+            <w:tcBorders>
+              <w:left w:val="single" w:sz="2" w:space="0" w:color="000000"/>
+              <w:bottom w:val="single" w:sz="2" w:space="0" w:color="000000"/>
+            </w:tcBorders>
+            <w:vAlign w:val="center"/>
+          </w:tcPr>
+          <w:p>
+            <w:pPr>
+              <w:pStyle w:val="Normal"/>
+              <w:spacing w:lineRule="auto" w:line="240" w:before="0" w:after="0"/>
+              <w:ind w:hanging="181" w:left="181"/>
+              <w:jc w:val="both"/>
+              <w:rPr>
+                <w:rFonts w:ascii="Arial" w:hAnsi="Arial" w:eastAsia="Times New Roman" w:cs="Arial"/>
+                <w:b/>
+                <w:kern w:val="0"/>
+                <w:sz w:val="18"/>
+                <w:szCs w:val="18"/>
+                <w:lang w:val="pt-PT" w:eastAsia="pt-BR"/>
+                <w14:ligatures w14:val="none"/>
+              </w:rPr>
+            </w:pPr>
+            <w:r>
+              <w:rPr>
+                <w:rFonts w:eastAsia="Times New Roman" w:cs="Arial" w:ascii="Arial" w:hAnsi="Arial"/>
+                <w:b/>
+                <w:kern w:val="0"/>
+                <w:sz w:val="18"/>
+                <w:szCs w:val="18"/>
+                <w:lang w:val="pt-PT" w:eastAsia="pt-BR"/>
+                <w14:ligatures w14:val="none"/>
+              </w:rPr>
+            </w:r>
+          </w:p>
+        </w:tc>
+        <w:tc>
+          <w:tcPr>
             <w:tcW w:w="443" w:type="dxa"/>
             <w:tcBorders>
               <w:left w:val="single" w:sz="2" w:space="0" w:color="000000"/>
@@ -2280,6 +2370,120 @@
         </w:tc>
         <w:tc>
           <w:tcPr>
+            <w:tcW w:w="444" w:type="dxa"/>
+            <w:tcBorders>
+              <w:left w:val="single" w:sz="2" w:space="0" w:color="000000"/>
+              <w:bottom w:val="single" w:sz="2" w:space="0" w:color="000000"/>
+            </w:tcBorders>
+            <w:vAlign w:val="center"/>
+          </w:tcPr>
+          <w:p>
+            <w:pPr>
+              <w:pStyle w:val="Normal"/>
+              <w:spacing w:lineRule="auto" w:line="240" w:before="0" w:after="0"/>
+              <w:ind w:hanging="181" w:left="181"/>
+              <w:jc w:val="both"/>
+              <w:rPr>
+                <w:rFonts w:ascii="Arial" w:hAnsi="Arial" w:eastAsia="Times New Roman" w:cs="Arial"/>
+                <w:b/>
+                <w:kern w:val="0"/>
+                <w:sz w:val="18"/>
+                <w:szCs w:val="18"/>
+                <w:lang w:val="pt-PT" w:eastAsia="pt-BR"/>
+                <w14:ligatures w14:val="none"/>
+              </w:rPr>
+            </w:pPr>
+            <w:r>
+              <w:rPr>
+                <w:rFonts w:eastAsia="Times New Roman" w:cs="Arial" w:ascii="Arial" w:hAnsi="Arial"/>
+                <w:b/>
+                <w:kern w:val="0"/>
+                <w:sz w:val="18"/>
+                <w:szCs w:val="18"/>
+                <w:lang w:val="pt-PT" w:eastAsia="pt-BR"/>
+                <w14:ligatures w14:val="none"/>
+              </w:rPr>
+            </w:r>
+          </w:p>
+        </w:tc>
+        <w:tc>
+          <w:tcPr>
+            <w:tcW w:w="441" w:type="dxa"/>
+            <w:tcBorders>
+              <w:left w:val="single" w:sz="2" w:space="0" w:color="000000"/>
+              <w:bottom w:val="single" w:sz="2" w:space="0" w:color="000000"/>
+            </w:tcBorders>
+            <w:vAlign w:val="center"/>
+          </w:tcPr>
+          <w:p>
+            <w:pPr>
+              <w:pStyle w:val="Normal"/>
+              <w:spacing w:lineRule="auto" w:line="240" w:before="0" w:after="0"/>
+              <w:ind w:hanging="181" w:left="181"/>
+              <w:jc w:val="both"/>
+              <w:rPr>
+                <w:rFonts w:ascii="Arial" w:hAnsi="Arial" w:eastAsia="Times New Roman" w:cs="Arial"/>
+                <w:b/>
+                <w:kern w:val="0"/>
+                <w:sz w:val="18"/>
+                <w:szCs w:val="18"/>
+                <w:lang w:val="pt-PT" w:eastAsia="pt-BR"/>
+                <w14:ligatures w14:val="none"/>
+              </w:rPr>
+            </w:pPr>
+            <w:r>
+              <w:rPr>
+                <w:rFonts w:eastAsia="Times New Roman" w:cs="Arial" w:ascii="Arial" w:hAnsi="Arial"/>
+                <w:b/>
+                <w:kern w:val="0"/>
+                <w:sz w:val="18"/>
+                <w:szCs w:val="18"/>
+                <w:lang w:val="pt-PT" w:eastAsia="pt-BR"/>
+                <w14:ligatures w14:val="none"/>
+              </w:rPr>
+            </w:r>
+          </w:p>
+        </w:tc>
+        <w:tc>
+          <w:tcPr>
+            <w:tcW w:w="445" w:type="dxa"/>
+            <w:tcBorders>
+              <w:left w:val="single" w:sz="2" w:space="0" w:color="000000"/>
+              <w:bottom w:val="single" w:sz="2" w:space="0" w:color="000000"/>
+            </w:tcBorders>
+            <w:vAlign w:val="center"/>
+          </w:tcPr>
+          <w:p>
+            <w:pPr>
+              <w:pStyle w:val="Normal"/>
+              <w:spacing w:lineRule="auto" w:line="240" w:before="0" w:after="0"/>
+              <w:ind w:hanging="181" w:left="181"/>
+              <w:jc w:val="both"/>
+              <w:rPr>
+                <w:rFonts w:ascii="Arial" w:hAnsi="Arial" w:eastAsia="Times New Roman" w:cs="Arial"/>
+                <w:b/>
+                <w:kern w:val="0"/>
+                <w:sz w:val="18"/>
+                <w:szCs w:val="18"/>
+                <w:lang w:val="pt-PT" w:eastAsia="pt-BR"/>
+                <w14:ligatures w14:val="none"/>
+              </w:rPr>
+            </w:pPr>
+            <w:r>
+              <w:rPr>
+                <w:rFonts w:eastAsia="Times New Roman" w:cs="Arial" w:ascii="Arial" w:hAnsi="Arial"/>
+                <w:b/>
+                <w:kern w:val="0"/>
+                <w:sz w:val="18"/>
+                <w:szCs w:val="18"/>
+                <w:lang w:val="pt-PT" w:eastAsia="pt-BR"/>
+                <w14:ligatures w14:val="none"/>
+              </w:rPr>
+            </w:r>
+          </w:p>
+        </w:tc>
+        <w:tc>
+          <w:tcPr>
             <w:tcW w:w="443" w:type="dxa"/>
             <w:tcBorders>
               <w:left w:val="single" w:sz="2" w:space="0" w:color="000000"/>
@@ -2470,235 +2674,7 @@
         </w:tc>
         <w:tc>
           <w:tcPr>
-            <w:tcW w:w="444" w:type="dxa"/>
-            <w:tcBorders>
-              <w:left w:val="single" w:sz="2" w:space="0" w:color="000000"/>
-              <w:bottom w:val="single" w:sz="2" w:space="0" w:color="000000"/>
-            </w:tcBorders>
-            <w:vAlign w:val="center"/>
-          </w:tcPr>
-          <w:p>
-            <w:pPr>
-              <w:pStyle w:val="Normal"/>
-              <w:spacing w:lineRule="auto" w:line="240" w:before="0" w:after="0"/>
-              <w:ind w:hanging="181" w:left="181"/>
-              <w:jc w:val="both"/>
-              <w:rPr>
-                <w:rFonts w:ascii="Arial" w:hAnsi="Arial" w:eastAsia="Times New Roman" w:cs="Arial"/>
-                <w:b/>
-                <w:kern w:val="0"/>
-                <w:sz w:val="18"/>
-                <w:szCs w:val="18"/>
-                <w:lang w:val="pt-PT" w:eastAsia="pt-BR"/>
-                <w14:ligatures w14:val="none"/>
-              </w:rPr>
-            </w:pPr>
-            <w:r>
-              <w:rPr>
-                <w:rFonts w:eastAsia="Times New Roman" w:cs="Arial" w:ascii="Arial" w:hAnsi="Arial"/>
-                <w:b/>
-                <w:kern w:val="0"/>
-                <w:sz w:val="18"/>
-                <w:szCs w:val="18"/>
-                <w:lang w:val="pt-PT" w:eastAsia="pt-BR"/>
-                <w14:ligatures w14:val="none"/>
-              </w:rPr>
-            </w:r>
-          </w:p>
-        </w:tc>
-        <w:tc>
-          <w:tcPr>
-            <w:tcW w:w="443" w:type="dxa"/>
-            <w:tcBorders>
-              <w:left w:val="single" w:sz="2" w:space="0" w:color="000000"/>
-              <w:bottom w:val="single" w:sz="2" w:space="0" w:color="000000"/>
-            </w:tcBorders>
-            <w:vAlign w:val="center"/>
-          </w:tcPr>
-          <w:p>
-            <w:pPr>
-              <w:pStyle w:val="Normal"/>
-              <w:spacing w:lineRule="auto" w:line="240" w:before="0" w:after="0"/>
-              <w:ind w:hanging="181" w:left="181"/>
-              <w:jc w:val="both"/>
-              <w:rPr>
-                <w:rFonts w:ascii="Arial" w:hAnsi="Arial" w:eastAsia="Times New Roman" w:cs="Arial"/>
-                <w:b/>
-                <w:kern w:val="0"/>
-                <w:sz w:val="18"/>
-                <w:szCs w:val="18"/>
-                <w:lang w:val="pt-PT" w:eastAsia="pt-BR"/>
-                <w14:ligatures w14:val="none"/>
-              </w:rPr>
-            </w:pPr>
-            <w:r>
-              <w:rPr>
-                <w:rFonts w:eastAsia="Times New Roman" w:cs="Arial" w:ascii="Arial" w:hAnsi="Arial"/>
-                <w:b/>
-                <w:kern w:val="0"/>
-                <w:sz w:val="18"/>
-                <w:szCs w:val="18"/>
-                <w:lang w:val="pt-PT" w:eastAsia="pt-BR"/>
-                <w14:ligatures w14:val="none"/>
-              </w:rPr>
-            </w:r>
-          </w:p>
-        </w:tc>
-        <w:tc>
-          <w:tcPr>
-            <w:tcW w:w="442" w:type="dxa"/>
-            <w:tcBorders>
-              <w:left w:val="single" w:sz="2" w:space="0" w:color="000000"/>
-              <w:bottom w:val="single" w:sz="2" w:space="0" w:color="000000"/>
-            </w:tcBorders>
-            <w:vAlign w:val="center"/>
-          </w:tcPr>
-          <w:p>
-            <w:pPr>
-              <w:pStyle w:val="Normal"/>
-              <w:spacing w:lineRule="auto" w:line="240" w:before="0" w:after="0"/>
-              <w:ind w:hanging="181" w:left="181"/>
-              <w:jc w:val="both"/>
-              <w:rPr>
-                <w:rFonts w:ascii="Arial" w:hAnsi="Arial" w:eastAsia="Times New Roman" w:cs="Arial"/>
-                <w:b/>
-                <w:kern w:val="0"/>
-                <w:sz w:val="18"/>
-                <w:szCs w:val="18"/>
-                <w:lang w:val="pt-PT" w:eastAsia="pt-BR"/>
-                <w14:ligatures w14:val="none"/>
-              </w:rPr>
-            </w:pPr>
-            <w:r>
-              <w:rPr>
-                <w:rFonts w:eastAsia="Times New Roman" w:cs="Arial" w:ascii="Arial" w:hAnsi="Arial"/>
-                <w:b/>
-                <w:kern w:val="0"/>
-                <w:sz w:val="18"/>
-                <w:szCs w:val="18"/>
-                <w:lang w:val="pt-PT" w:eastAsia="pt-BR"/>
-                <w14:ligatures w14:val="none"/>
-              </w:rPr>
-            </w:r>
-          </w:p>
-        </w:tc>
-        <w:tc>
-          <w:tcPr>
-            <w:tcW w:w="444" w:type="dxa"/>
-            <w:tcBorders>
-              <w:left w:val="single" w:sz="2" w:space="0" w:color="000000"/>
-              <w:bottom w:val="single" w:sz="2" w:space="0" w:color="000000"/>
-            </w:tcBorders>
-            <w:vAlign w:val="center"/>
-          </w:tcPr>
-          <w:p>
-            <w:pPr>
-              <w:pStyle w:val="Normal"/>
-              <w:spacing w:lineRule="auto" w:line="240" w:before="0" w:after="0"/>
-              <w:ind w:hanging="181" w:left="181"/>
-              <w:jc w:val="both"/>
-              <w:rPr>
-                <w:rFonts w:ascii="Arial" w:hAnsi="Arial" w:eastAsia="Times New Roman" w:cs="Arial"/>
-                <w:b/>
-                <w:kern w:val="0"/>
-                <w:sz w:val="18"/>
-                <w:szCs w:val="18"/>
-                <w:lang w:val="pt-PT" w:eastAsia="pt-BR"/>
-                <w14:ligatures w14:val="none"/>
-              </w:rPr>
-            </w:pPr>
-            <w:r>
-              <w:rPr>
-                <w:rFonts w:eastAsia="Times New Roman" w:cs="Arial" w:ascii="Arial" w:hAnsi="Arial"/>
-                <w:b/>
-                <w:kern w:val="0"/>
-                <w:sz w:val="18"/>
-                <w:szCs w:val="18"/>
-                <w:lang w:val="pt-PT" w:eastAsia="pt-BR"/>
-                <w14:ligatures w14:val="none"/>
-              </w:rPr>
-            </w:r>
-          </w:p>
-        </w:tc>
-        <w:tc>
-          <w:tcPr>
-            <w:tcW w:w="443" w:type="dxa"/>
-            <w:tcBorders>
-              <w:left w:val="single" w:sz="2" w:space="0" w:color="000000"/>
-              <w:bottom w:val="single" w:sz="2" w:space="0" w:color="000000"/>
-            </w:tcBorders>
-            <w:vAlign w:val="center"/>
-          </w:tcPr>
-          <w:p>
-            <w:pPr>
-              <w:pStyle w:val="Normal"/>
-              <w:spacing w:lineRule="auto" w:line="240" w:before="0" w:after="0"/>
-              <w:ind w:hanging="181" w:left="181"/>
-              <w:jc w:val="both"/>
-              <w:rPr>
-                <w:rFonts w:ascii="Arial" w:hAnsi="Arial" w:eastAsia="Times New Roman" w:cs="Arial"/>
-                <w:b/>
-                <w:kern w:val="0"/>
-                <w:sz w:val="18"/>
-                <w:szCs w:val="18"/>
-                <w:lang w:val="pt-PT" w:eastAsia="pt-BR"/>
-                <w14:ligatures w14:val="none"/>
-              </w:rPr>
-            </w:pPr>
-            <w:r>
-              <w:rPr>
-                <w:rFonts w:eastAsia="Times New Roman" w:cs="Arial" w:ascii="Arial" w:hAnsi="Arial"/>
-                <w:b/>
-                <w:kern w:val="0"/>
-                <w:sz w:val="18"/>
-                <w:szCs w:val="18"/>
-                <w:lang w:val="pt-PT" w:eastAsia="pt-BR"/>
-                <w14:ligatures w14:val="none"/>
-              </w:rPr>
-            </w:r>
-          </w:p>
-        </w:tc>
-        <w:tc>
-          <w:tcPr>
-            <w:tcW w:w="442" w:type="dxa"/>
-            <w:tcBorders>
-              <w:left w:val="single" w:sz="2" w:space="0" w:color="000000"/>
-              <w:bottom w:val="single" w:sz="2" w:space="0" w:color="000000"/>
-            </w:tcBorders>
-            <w:vAlign w:val="center"/>
-          </w:tcPr>
-          <w:p>
-            <w:pPr>
-              <w:pStyle w:val="Normal"/>
-              <w:spacing w:lineRule="auto" w:line="240" w:before="0" w:after="0"/>
-              <w:ind w:hanging="181" w:left="181"/>
-              <w:jc w:val="both"/>
-              <w:rPr>
-                <w:rFonts w:ascii="Arial" w:hAnsi="Arial" w:eastAsia="Times New Roman" w:cs="Arial"/>
-                <w:b/>
-                <w:kern w:val="0"/>
-                <w:sz w:val="18"/>
-                <w:szCs w:val="18"/>
-                <w:lang w:val="pt-PT" w:eastAsia="pt-BR"/>
-                <w14:ligatures w14:val="none"/>
-              </w:rPr>
-            </w:pPr>
-            <w:r>
-              <w:rPr>
-                <w:rFonts w:eastAsia="Times New Roman" w:cs="Arial" w:ascii="Arial" w:hAnsi="Arial"/>
-                <w:b/>
-                <w:kern w:val="0"/>
-                <w:sz w:val="18"/>
-                <w:szCs w:val="18"/>
-                <w:lang w:val="pt-PT" w:eastAsia="pt-BR"/>
-                <w14:ligatures w14:val="none"/>
-              </w:rPr>
-            </w:r>
-          </w:p>
-        </w:tc>
-        <w:tc>
-          <w:tcPr>
-            <w:tcW w:w="444" w:type="dxa"/>
+            <w:tcW w:w="445" w:type="dxa"/>
             <w:tcBorders>
               <w:left w:val="single" w:sz="2" w:space="0" w:color="000000"/>
               <w:bottom w:val="single" w:sz="2" w:space="0" w:color="000000"/>
@@ -2720,7 +2696,7 @@
         </w:tc>
         <w:tc>
           <w:tcPr>
-            <w:tcW w:w="440" w:type="dxa"/>
+            <w:tcW w:w="437" w:type="dxa"/>
             <w:tcBorders>
               <w:left w:val="single" w:sz="2" w:space="0" w:color="000000"/>
               <w:bottom w:val="single" w:sz="2" w:space="0" w:color="000000"/>

</xml_diff>